<commit_message>
added proper code for sign signature line
</commit_message>
<xml_diff>
--- a/Digital-Signature/Sign-signature-line/.NET/Sign-signature-line/Data/Template.docx
+++ b/Digital-Signature/Sign-signature-line/.NET/Sign-signature-line/Data/Template.docx
@@ -1,23 +1,33 @@
 
 <file path=word/document.xml><?xml version="1.0" encoding="utf-8"?>
-<w:document xmlns:wpc="http://schemas.microsoft.com/office/word/2010/wordprocessingCanvas" xmlns:cx="http://schemas.microsoft.com/office/drawing/2014/chartex" xmlns:cx1="http://schemas.microsoft.com/office/drawing/2015/9/8/chartex" xmlns:cx2="http://schemas.microsoft.com/office/drawing/2015/10/21/chartex" xmlns:cx3="http://schemas.microsoft.com/office/drawing/2016/5/9/chartex" xmlns:cx4="http://schemas.microsoft.com/office/drawing/2016/5/10/chartex" xmlns:cx5="http://schemas.microsoft.com/office/drawing/2016/5/11/chartex" xmlns:cx6="http://schemas.microsoft.com/office/drawing/2016/5/12/chartex" xmlns:cx7="http://schemas.microsoft.com/office/drawing/2016/5/13/chartex" xmlns:cx8="http://schemas.microsoft.com/office/drawing/2016/5/14/chartex" xmlns:mc="http://schemas.openxmlformats.org/markup-compatibility/2006" xmlns:aink="http://schemas.microsoft.com/office/drawing/2016/ink" xmlns:am3d="http://schemas.microsoft.com/office/drawing/2017/model3d" xmlns:o="urn:schemas-microsoft-com:office:office" xmlns:oel="http://schemas.microsoft.com/office/2019/extlst" xmlns:r="http://schemas.openxmlformats.org/officeDocument/2006/relationships" xmlns:m="http://schemas.openxmlformats.org/officeDocument/2006/math" xmlns:v="urn:schemas-microsoft-com:vml" xmlns:wp14="http://schemas.microsoft.com/office/word/2010/wordprocessingDrawing" xmlns:wp="http://schemas.openxmlformats.org/drawingml/2006/wordprocessingDrawing" xmlns:w10="urn:schemas-microsoft-com:office:word" xmlns:w="http://schemas.openxmlformats.org/wordprocessingml/2006/main" xmlns:w14="http://schemas.microsoft.com/office/word/2010/wordml" xmlns:w15="http://schemas.microsoft.com/office/word/2012/wordml" xmlns:w16cex="http://schemas.microsoft.com/office/word/2018/wordml/cex" xmlns:w16cid="http://schemas.microsoft.com/office/word/2016/wordml/cid" xmlns:w16="http://schemas.microsoft.com/office/word/2018/wordml" xmlns:w16du="http://schemas.microsoft.com/office/word/2023/wordml/word16du" xmlns:w16sdtdh="http://schemas.microsoft.com/office/word/2020/wordml/sdtdatahash" xmlns:w16sdtfl="http://schemas.microsoft.com/office/word/2024/wordml/sdtformatlock" xmlns:w16se="http://schemas.microsoft.com/office/word/2015/wordml/symex" xmlns:wpg="http://schemas.microsoft.com/office/word/2010/wordprocessingGroup" xmlns:wpi="http://schemas.microsoft.com/office/word/2010/wordprocessingInk" xmlns:wne="http://schemas.microsoft.com/office/word/2006/wordml" xmlns:wps="http://schemas.microsoft.com/office/word/2010/wordprocessingShape" mc:Ignorable="w14 w15 w16se w16cid w16 w16cex w16sdtdh w16sdtfl w16du wp14">
+<w:document xmlns:wpc="http://schemas.microsoft.com/office/word/2010/wordprocessingCanvas" xmlns:mc="http://schemas.openxmlformats.org/markup-compatibility/2006" xmlns:o="urn:schemas-microsoft-com:office:office" xmlns:r="http://schemas.openxmlformats.org/officeDocument/2006/relationships" xmlns:m="http://schemas.openxmlformats.org/officeDocument/2006/math" xmlns:v="urn:schemas-microsoft-com:vml" xmlns:wp14="http://schemas.microsoft.com/office/word/2010/wordprocessingDrawing" xmlns:wp="http://schemas.openxmlformats.org/drawingml/2006/wordprocessingDrawing" xmlns:w="http://schemas.openxmlformats.org/wordprocessingml/2006/main" xmlns:w10="urn:schemas-microsoft-com:office:word" xmlns:w14="http://schemas.microsoft.com/office/word/2010/wordml" xmlns:w15="http://schemas.microsoft.com/office/word/2012/wordml" xmlns:wpg="http://schemas.microsoft.com/office/word/2010/wordprocessingGroup" xmlns:wpi="http://schemas.microsoft.com/office/word/2010/wordprocessingInk" xmlns:wne="http://schemas.microsoft.com/office/word/2006/wordml" xmlns:wps="http://schemas.microsoft.com/office/word/2010/wordprocessingShape" xmlns:cx="http://schemas.microsoft.com/office/drawing/2014/chartex" xmlns:aink="http://schemas.microsoft.com/office/drawing/2016/ink" xmlns:am3d="http://schemas.microsoft.com/office/drawing/2017/model3d" xmlns:w16cex="http://schemas.microsoft.com/office/word/2018/wordml/cex" xmlns:w16cid="http://schemas.microsoft.com/office/word/2016/wordml/cid" xmlns:w16sdtdh="http://schemas.microsoft.com/office/word/2020/wordml/sdtdatahash" xmlns:w16se="http://schemas.microsoft.com/office/word/2015/wordml/symex" xmlns:w16="http://schemas.microsoft.com/office/word/2018/wordml" xmlns:c="http://schemas.openxmlformats.org/drawingml/2006/chart" mc:Ignorable="w14 w15 w16se w16cid w16 w16cex w16sdtdh wp14">
   <w:body>
     <w:p>
+      <w:pPr>
+        <w:spacing/>
+        <w:rPr/>
+      </w:pPr>
       <w:r>
         <w:rPr>
           <w:b/>
           <w:bCs/>
         </w:rPr>
-        <w:t>Document Approval Notice</w:t>
-      </w:r>
-    </w:p>
-    <w:p>
-      <w:r>
-        <w:t>This document has been prepared for final review and approval. The information presented has been verified and is ready for submission. Please review the details carefully before providing approval.</w:t>
+        <w:t xml:space="preserve">Document Approval Notice</w:t>
       </w:r>
     </w:p>
     <w:p>
       <w:pPr>
+        <w:spacing/>
+        <w:rPr/>
+      </w:pPr>
+      <w:r>
+        <w:rPr/>
+        <w:t xml:space="preserve">This document has been prepared for final review and approval. The information presented has been verified and is ready for submission. Please review the details carefully before providing approval.</w:t>
+      </w:r>
+    </w:p>
+    <w:p>
+      <w:pPr>
+        <w:spacing/>
         <w:rPr>
           <w:b/>
           <w:bCs/>
@@ -28,13 +38,21 @@
           <w:b/>
           <w:bCs/>
         </w:rPr>
-        <w:t>Document Information</w:t>
+        <w:t xml:space="preserve">Document Information</w:t>
       </w:r>
     </w:p>
     <w:tbl>
       <w:tblPr>
         <w:tblW w:w="0" w:type="auto"/>
         <w:tblCellSpacing w:w="15" w:type="dxa"/>
+        <w:tblBorders>
+          <w:top w:val="none" w:color="auto" w:sz="0" w:space="0"/>
+          <w:left w:val="none" w:color="auto" w:sz="0" w:space="0"/>
+          <w:bottom w:val="none" w:color="auto" w:sz="0" w:space="0"/>
+          <w:right w:val="none" w:color="auto" w:sz="0" w:space="0"/>
+          <w:insideH w:val="none" w:color="auto" w:sz="0" w:space="0"/>
+          <w:insideV w:val="none" w:color="auto" w:sz="0" w:space="0"/>
+        </w:tblBorders>
         <w:tblCellMar>
           <w:top w:w="15" w:type="dxa"/>
           <w:left w:w="15" w:type="dxa"/>
@@ -53,19 +71,20 @@
         </w:trPr>
         <w:tc>
           <w:tcPr>
-            <w:tcW w:w="2287" w:type="dxa"/>
+            <w:tcW w:type="dxa" w:w="2287"/>
             <w:tcBorders>
-              <w:top w:val="single" w:sz="6" w:space="0" w:color="E6E6E6"/>
-              <w:left w:val="single" w:sz="6" w:space="0" w:color="E6E6E6"/>
-              <w:bottom w:val="single" w:sz="6" w:space="0" w:color="E6E6E6"/>
-              <w:right w:val="single" w:sz="6" w:space="0" w:color="E6E6E6"/>
+              <w:top w:val="single" w:color="E6E6E6" w:sz="6" w:space="0"/>
+              <w:left w:val="single" w:color="E6E6E6" w:sz="6" w:space="0"/>
+              <w:bottom w:val="single" w:color="E6E6E6" w:sz="6" w:space="0"/>
+              <w:right w:val="single" w:color="E6E6E6" w:sz="6" w:space="0"/>
             </w:tcBorders>
-            <w:shd w:val="clear" w:color="auto" w:fill="F5F5F5"/>
+            <w:shd w:fill="F5F5F5" w:color="auto" w:val="clear"/>
+            <w:hideMark/>
             <w:vAlign w:val="center"/>
-            <w:hideMark/>
           </w:tcPr>
           <w:p>
             <w:pPr>
+              <w:spacing/>
               <w:rPr>
                 <w:b/>
                 <w:bCs/>
@@ -76,25 +95,26 @@
                 <w:b/>
                 <w:bCs/>
               </w:rPr>
-              <w:t>Item</w:t>
+              <w:t xml:space="preserve">Item</w:t>
             </w:r>
           </w:p>
         </w:tc>
         <w:tc>
           <w:tcPr>
-            <w:tcW w:w="6255" w:type="dxa"/>
+            <w:tcW w:type="dxa" w:w="6255"/>
             <w:tcBorders>
-              <w:top w:val="single" w:sz="6" w:space="0" w:color="E6E6E6"/>
-              <w:left w:val="single" w:sz="6" w:space="0" w:color="E6E6E6"/>
-              <w:bottom w:val="single" w:sz="6" w:space="0" w:color="E6E6E6"/>
-              <w:right w:val="single" w:sz="6" w:space="0" w:color="E6E6E6"/>
+              <w:top w:val="single" w:color="E6E6E6" w:sz="6" w:space="0"/>
+              <w:left w:val="single" w:color="E6E6E6" w:sz="6" w:space="0"/>
+              <w:bottom w:val="single" w:color="E6E6E6" w:sz="6" w:space="0"/>
+              <w:right w:val="single" w:color="E6E6E6" w:sz="6" w:space="0"/>
             </w:tcBorders>
-            <w:shd w:val="clear" w:color="auto" w:fill="F5F5F5"/>
+            <w:shd w:fill="F5F5F5" w:color="auto" w:val="clear"/>
+            <w:hideMark/>
             <w:vAlign w:val="center"/>
-            <w:hideMark/>
           </w:tcPr>
           <w:p>
             <w:pPr>
+              <w:spacing/>
               <w:rPr>
                 <w:b/>
                 <w:bCs/>
@@ -105,7 +125,7 @@
                 <w:b/>
                 <w:bCs/>
               </w:rPr>
-              <w:t>Details</w:t>
+              <w:t xml:space="preserve">Details</w:t>
             </w:r>
           </w:p>
         </w:tc>
@@ -116,37 +136,47 @@
         </w:trPr>
         <w:tc>
           <w:tcPr>
-            <w:tcW w:w="2287" w:type="dxa"/>
+            <w:tcW w:type="dxa" w:w="2287"/>
             <w:tcBorders>
-              <w:top w:val="single" w:sz="6" w:space="0" w:color="E6E6E6"/>
-              <w:left w:val="single" w:sz="6" w:space="0" w:color="E6E6E6"/>
-              <w:bottom w:val="single" w:sz="6" w:space="0" w:color="E6E6E6"/>
-              <w:right w:val="single" w:sz="6" w:space="0" w:color="E6E6E6"/>
+              <w:top w:val="single" w:color="E6E6E6" w:sz="6" w:space="0"/>
+              <w:left w:val="single" w:color="E6E6E6" w:sz="6" w:space="0"/>
+              <w:bottom w:val="single" w:color="E6E6E6" w:sz="6" w:space="0"/>
+              <w:right w:val="single" w:color="E6E6E6" w:sz="6" w:space="0"/>
             </w:tcBorders>
+            <w:hideMark/>
             <w:vAlign w:val="center"/>
-            <w:hideMark/>
           </w:tcPr>
           <w:p>
+            <w:pPr>
+              <w:spacing/>
+              <w:rPr/>
+            </w:pPr>
             <w:r>
-              <w:t>Document ID</w:t>
+              <w:rPr/>
+              <w:t xml:space="preserve">Document ID</w:t>
             </w:r>
           </w:p>
         </w:tc>
         <w:tc>
           <w:tcPr>
-            <w:tcW w:w="6255" w:type="dxa"/>
+            <w:tcW w:type="dxa" w:w="6255"/>
             <w:tcBorders>
-              <w:top w:val="single" w:sz="6" w:space="0" w:color="E6E6E6"/>
-              <w:left w:val="single" w:sz="6" w:space="0" w:color="E6E6E6"/>
-              <w:bottom w:val="single" w:sz="6" w:space="0" w:color="E6E6E6"/>
-              <w:right w:val="single" w:sz="6" w:space="0" w:color="E6E6E6"/>
+              <w:top w:val="single" w:color="E6E6E6" w:sz="6" w:space="0"/>
+              <w:left w:val="single" w:color="E6E6E6" w:sz="6" w:space="0"/>
+              <w:bottom w:val="single" w:color="E6E6E6" w:sz="6" w:space="0"/>
+              <w:right w:val="single" w:color="E6E6E6" w:sz="6" w:space="0"/>
             </w:tcBorders>
+            <w:hideMark/>
             <w:vAlign w:val="center"/>
-            <w:hideMark/>
           </w:tcPr>
           <w:p>
+            <w:pPr>
+              <w:spacing/>
+              <w:rPr/>
+            </w:pPr>
             <w:r>
-              <w:t>DOC-2026-001</w:t>
+              <w:rPr/>
+              <w:t xml:space="preserve">DOC-2026-001</w:t>
             </w:r>
           </w:p>
         </w:tc>
@@ -157,37 +187,47 @@
         </w:trPr>
         <w:tc>
           <w:tcPr>
-            <w:tcW w:w="2287" w:type="dxa"/>
+            <w:tcW w:type="dxa" w:w="2287"/>
             <w:tcBorders>
-              <w:top w:val="single" w:sz="6" w:space="0" w:color="E6E6E6"/>
-              <w:left w:val="single" w:sz="6" w:space="0" w:color="E6E6E6"/>
-              <w:bottom w:val="single" w:sz="6" w:space="0" w:color="E6E6E6"/>
-              <w:right w:val="single" w:sz="6" w:space="0" w:color="E6E6E6"/>
+              <w:top w:val="single" w:color="E6E6E6" w:sz="6" w:space="0"/>
+              <w:left w:val="single" w:color="E6E6E6" w:sz="6" w:space="0"/>
+              <w:bottom w:val="single" w:color="E6E6E6" w:sz="6" w:space="0"/>
+              <w:right w:val="single" w:color="E6E6E6" w:sz="6" w:space="0"/>
             </w:tcBorders>
+            <w:hideMark/>
             <w:vAlign w:val="center"/>
-            <w:hideMark/>
           </w:tcPr>
           <w:p>
+            <w:pPr>
+              <w:spacing/>
+              <w:rPr/>
+            </w:pPr>
             <w:r>
-              <w:t>Document Type</w:t>
+              <w:rPr/>
+              <w:t xml:space="preserve">Document Type</w:t>
             </w:r>
           </w:p>
         </w:tc>
         <w:tc>
           <w:tcPr>
-            <w:tcW w:w="6255" w:type="dxa"/>
+            <w:tcW w:type="dxa" w:w="6255"/>
             <w:tcBorders>
-              <w:top w:val="single" w:sz="6" w:space="0" w:color="E6E6E6"/>
-              <w:left w:val="single" w:sz="6" w:space="0" w:color="E6E6E6"/>
-              <w:bottom w:val="single" w:sz="6" w:space="0" w:color="E6E6E6"/>
-              <w:right w:val="single" w:sz="6" w:space="0" w:color="E6E6E6"/>
+              <w:top w:val="single" w:color="E6E6E6" w:sz="6" w:space="0"/>
+              <w:left w:val="single" w:color="E6E6E6" w:sz="6" w:space="0"/>
+              <w:bottom w:val="single" w:color="E6E6E6" w:sz="6" w:space="0"/>
+              <w:right w:val="single" w:color="E6E6E6" w:sz="6" w:space="0"/>
             </w:tcBorders>
+            <w:hideMark/>
             <w:vAlign w:val="center"/>
-            <w:hideMark/>
           </w:tcPr>
           <w:p>
+            <w:pPr>
+              <w:spacing/>
+              <w:rPr/>
+            </w:pPr>
             <w:r>
-              <w:t>Approval Request</w:t>
+              <w:rPr/>
+              <w:t xml:space="preserve">Approval Request</w:t>
             </w:r>
           </w:p>
         </w:tc>
@@ -198,37 +238,47 @@
         </w:trPr>
         <w:tc>
           <w:tcPr>
-            <w:tcW w:w="2287" w:type="dxa"/>
+            <w:tcW w:type="dxa" w:w="2287"/>
             <w:tcBorders>
-              <w:top w:val="single" w:sz="6" w:space="0" w:color="E6E6E6"/>
-              <w:left w:val="single" w:sz="6" w:space="0" w:color="E6E6E6"/>
-              <w:bottom w:val="single" w:sz="6" w:space="0" w:color="E6E6E6"/>
-              <w:right w:val="single" w:sz="6" w:space="0" w:color="E6E6E6"/>
+              <w:top w:val="single" w:color="E6E6E6" w:sz="6" w:space="0"/>
+              <w:left w:val="single" w:color="E6E6E6" w:sz="6" w:space="0"/>
+              <w:bottom w:val="single" w:color="E6E6E6" w:sz="6" w:space="0"/>
+              <w:right w:val="single" w:color="E6E6E6" w:sz="6" w:space="0"/>
             </w:tcBorders>
+            <w:hideMark/>
             <w:vAlign w:val="center"/>
-            <w:hideMark/>
           </w:tcPr>
           <w:p>
+            <w:pPr>
+              <w:spacing/>
+              <w:rPr/>
+            </w:pPr>
             <w:r>
-              <w:t>Prepared By</w:t>
+              <w:rPr/>
+              <w:t xml:space="preserve">Prepared By</w:t>
             </w:r>
           </w:p>
         </w:tc>
         <w:tc>
           <w:tcPr>
-            <w:tcW w:w="6255" w:type="dxa"/>
+            <w:tcW w:type="dxa" w:w="6255"/>
             <w:tcBorders>
-              <w:top w:val="single" w:sz="6" w:space="0" w:color="E6E6E6"/>
-              <w:left w:val="single" w:sz="6" w:space="0" w:color="E6E6E6"/>
-              <w:bottom w:val="single" w:sz="6" w:space="0" w:color="E6E6E6"/>
-              <w:right w:val="single" w:sz="6" w:space="0" w:color="E6E6E6"/>
+              <w:top w:val="single" w:color="E6E6E6" w:sz="6" w:space="0"/>
+              <w:left w:val="single" w:color="E6E6E6" w:sz="6" w:space="0"/>
+              <w:bottom w:val="single" w:color="E6E6E6" w:sz="6" w:space="0"/>
+              <w:right w:val="single" w:color="E6E6E6" w:sz="6" w:space="0"/>
             </w:tcBorders>
+            <w:hideMark/>
             <w:vAlign w:val="center"/>
-            <w:hideMark/>
           </w:tcPr>
           <w:p>
+            <w:pPr>
+              <w:spacing/>
+              <w:rPr/>
+            </w:pPr>
             <w:r>
-              <w:t>Documentation Team</w:t>
+              <w:rPr/>
+              <w:t xml:space="preserve">Documentation Team</w:t>
             </w:r>
           </w:p>
         </w:tc>
@@ -239,37 +289,47 @@
         </w:trPr>
         <w:tc>
           <w:tcPr>
-            <w:tcW w:w="2287" w:type="dxa"/>
+            <w:tcW w:type="dxa" w:w="2287"/>
             <w:tcBorders>
-              <w:top w:val="single" w:sz="6" w:space="0" w:color="E6E6E6"/>
-              <w:left w:val="single" w:sz="6" w:space="0" w:color="E6E6E6"/>
-              <w:bottom w:val="single" w:sz="6" w:space="0" w:color="E6E6E6"/>
-              <w:right w:val="single" w:sz="6" w:space="0" w:color="E6E6E6"/>
+              <w:top w:val="single" w:color="E6E6E6" w:sz="6" w:space="0"/>
+              <w:left w:val="single" w:color="E6E6E6" w:sz="6" w:space="0"/>
+              <w:bottom w:val="single" w:color="E6E6E6" w:sz="6" w:space="0"/>
+              <w:right w:val="single" w:color="E6E6E6" w:sz="6" w:space="0"/>
             </w:tcBorders>
+            <w:hideMark/>
             <w:vAlign w:val="center"/>
-            <w:hideMark/>
           </w:tcPr>
           <w:p>
+            <w:pPr>
+              <w:spacing/>
+              <w:rPr/>
+            </w:pPr>
             <w:r>
-              <w:t>Review Date</w:t>
+              <w:rPr/>
+              <w:t xml:space="preserve">Review Date</w:t>
             </w:r>
           </w:p>
         </w:tc>
         <w:tc>
           <w:tcPr>
-            <w:tcW w:w="6255" w:type="dxa"/>
+            <w:tcW w:type="dxa" w:w="6255"/>
             <w:tcBorders>
-              <w:top w:val="single" w:sz="6" w:space="0" w:color="E6E6E6"/>
-              <w:left w:val="single" w:sz="6" w:space="0" w:color="E6E6E6"/>
-              <w:bottom w:val="single" w:sz="6" w:space="0" w:color="E6E6E6"/>
-              <w:right w:val="single" w:sz="6" w:space="0" w:color="E6E6E6"/>
+              <w:top w:val="single" w:color="E6E6E6" w:sz="6" w:space="0"/>
+              <w:left w:val="single" w:color="E6E6E6" w:sz="6" w:space="0"/>
+              <w:bottom w:val="single" w:color="E6E6E6" w:sz="6" w:space="0"/>
+              <w:right w:val="single" w:color="E6E6E6" w:sz="6" w:space="0"/>
             </w:tcBorders>
+            <w:hideMark/>
             <w:vAlign w:val="center"/>
-            <w:hideMark/>
           </w:tcPr>
           <w:p>
+            <w:pPr>
+              <w:spacing/>
+              <w:rPr/>
+            </w:pPr>
             <w:r>
-              <w:t>September 23, 2026</w:t>
+              <w:rPr/>
+              <w:t xml:space="preserve">September 23, 2026</w:t>
             </w:r>
           </w:p>
         </w:tc>
@@ -280,59 +340,108 @@
         </w:trPr>
         <w:tc>
           <w:tcPr>
-            <w:tcW w:w="2287" w:type="dxa"/>
+            <w:tcW w:type="dxa" w:w="2287"/>
             <w:tcBorders>
-              <w:top w:val="single" w:sz="6" w:space="0" w:color="E6E6E6"/>
-              <w:left w:val="single" w:sz="6" w:space="0" w:color="E6E6E6"/>
-              <w:bottom w:val="single" w:sz="6" w:space="0" w:color="E6E6E6"/>
-              <w:right w:val="single" w:sz="6" w:space="0" w:color="E6E6E6"/>
+              <w:top w:val="single" w:color="E6E6E6" w:sz="6" w:space="0"/>
+              <w:left w:val="single" w:color="E6E6E6" w:sz="6" w:space="0"/>
+              <w:bottom w:val="single" w:color="E6E6E6" w:sz="6" w:space="0"/>
+              <w:right w:val="single" w:color="E6E6E6" w:sz="6" w:space="0"/>
             </w:tcBorders>
+            <w:hideMark/>
             <w:vAlign w:val="center"/>
-            <w:hideMark/>
           </w:tcPr>
           <w:p>
+            <w:pPr>
+              <w:spacing/>
+              <w:rPr/>
+            </w:pPr>
             <w:r>
-              <w:t>Status</w:t>
+              <w:rPr/>
+              <w:t xml:space="preserve">Status</w:t>
             </w:r>
           </w:p>
         </w:tc>
         <w:tc>
           <w:tcPr>
-            <w:tcW w:w="6255" w:type="dxa"/>
+            <w:tcW w:type="dxa" w:w="6255"/>
             <w:tcBorders>
-              <w:top w:val="single" w:sz="6" w:space="0" w:color="E6E6E6"/>
-              <w:left w:val="single" w:sz="6" w:space="0" w:color="E6E6E6"/>
-              <w:bottom w:val="single" w:sz="6" w:space="0" w:color="E6E6E6"/>
-              <w:right w:val="single" w:sz="6" w:space="0" w:color="E6E6E6"/>
+              <w:top w:val="single" w:color="E6E6E6" w:sz="6" w:space="0"/>
+              <w:left w:val="single" w:color="E6E6E6" w:sz="6" w:space="0"/>
+              <w:bottom w:val="single" w:color="E6E6E6" w:sz="6" w:space="0"/>
+              <w:right w:val="single" w:color="E6E6E6" w:sz="6" w:space="0"/>
             </w:tcBorders>
+            <w:hideMark/>
             <w:vAlign w:val="center"/>
-            <w:hideMark/>
           </w:tcPr>
           <w:p>
+            <w:pPr>
+              <w:spacing/>
+              <w:rPr/>
+            </w:pPr>
             <w:r>
-              <w:t>Pending Approval</w:t>
+              <w:rPr/>
+              <w:t xml:space="preserve">Pending Approval</w:t>
             </w:r>
           </w:p>
         </w:tc>
       </w:tr>
     </w:tbl>
-    <w:p/>
     <w:p>
+      <w:pPr>
+        <w:spacing/>
+        <w:rPr/>
+      </w:pPr>
+    </w:p>
+    <w:p>
+      <w:pPr>
+        <w:spacing/>
+        <w:rPr/>
+      </w:pPr>
       <w:r>
-        <w:t>The approval of this document requires authorization from the designated reviewer. By signing in the signature line provided below, the reviewer confirms that the document has been reviewed and approved for its intended purpose.</w:t>
+        <w:rPr/>
+        <w:t xml:space="preserve">The approval of this document requires authorization from the designated reviewer. By signing in the signature line provided below, the reviewer confirms that the document has been reviewed and approved for its intended purpose.</w:t>
       </w:r>
     </w:p>
-    <w:p/>
     <w:p>
+      <w:pPr>
+        <w:spacing/>
+        <w:rPr/>
+      </w:pPr>
+    </w:p>
+    <w:p>
+      <w:pPr>
+        <w:spacing/>
+        <w:rPr/>
+      </w:pPr>
       <w:r>
+        <w:rPr/>
         <w:t xml:space="preserve">Please sign below: </w:t>
       </w:r>
     </w:p>
-    <w:p/>
+    <w:p>
+      <w:pPr>
+        <w:spacing/>
+        <w:rPr/>
+      </w:pPr>
+      <w:r>
+        <w:rPr/>
+        <w:pict>
+          <v:shape type="#_x0000_t75" style="margin-left:0pt;margin-top:0pt;width:200pt;height:100pt;mso-position-horizontal-relative:margin;mso-position-vertical-relative:margin;visibility:visible" wrapcoords="0 21600 21600 21600 21600 0 0 0">
+            <v:imagedata r:id="rId1" o:title=""/>
+            <w10:wrap type="none"/>
+            <o:lock v:ext="edit" ungrouping="t" rotation="t" cropping="t" verticies="t" text="t" grouping="t"/>
+            <o:signatureline id="{BF5BDA86-5B71-47D5-8CD0-B575AE9B2F9E}" provid="{00000000-0000-0000-0000-000000000000}" o:suggestedsigner="John Doe" o:suggestedsigner2="Manager" o:suggestedsigneremail="john.doe@example.com" signinginstructions="Please review and sign." allowcomments="t" showsigndate="t" issignatureline="t" defaultinstructions="t"/>
+          </v:shape>
+        </w:pict>
+      </w:r>
+    </w:p>
     <w:sectPr>
+      <w:type w:val="nextPage"/>
       <w:pgSz w:w="12240" w:h="15840"/>
       <w:pgMar w:top="1440" w:right="1440" w:bottom="1440" w:left="1440" w:header="720" w:footer="720" w:gutter="0"/>
-      <w:cols w:space="720"/>
+      <w:pgBorders/>
+      <w:pgNumType w:fmt="decimal"/>
+      <w:cols w:num="1" w:equalWidth="1" w:space="720"/>
       <w:docGrid w:linePitch="360"/>
     </w:sectPr>
   </w:body>
@@ -340,11 +449,11 @@
 </file>
 
 <file path=word/styles.xml><?xml version="1.0" encoding="utf-8"?>
-<w:styles xmlns:mc="http://schemas.openxmlformats.org/markup-compatibility/2006" xmlns:r="http://schemas.openxmlformats.org/officeDocument/2006/relationships" xmlns:w="http://schemas.openxmlformats.org/wordprocessingml/2006/main" xmlns:w14="http://schemas.microsoft.com/office/word/2010/wordml" xmlns:w15="http://schemas.microsoft.com/office/word/2012/wordml" xmlns:w16cex="http://schemas.microsoft.com/office/word/2018/wordml/cex" xmlns:w16cid="http://schemas.microsoft.com/office/word/2016/wordml/cid" xmlns:w16="http://schemas.microsoft.com/office/word/2018/wordml" xmlns:w16du="http://schemas.microsoft.com/office/word/2023/wordml/word16du" xmlns:w16sdtdh="http://schemas.microsoft.com/office/word/2020/wordml/sdtdatahash" xmlns:w16sdtfl="http://schemas.microsoft.com/office/word/2024/wordml/sdtformatlock" xmlns:w16se="http://schemas.microsoft.com/office/word/2015/wordml/symex" mc:Ignorable="w14 w15 w16se w16cid w16 w16cex w16sdtdh w16sdtfl w16du">
+<w:styles xmlns:mc="http://schemas.openxmlformats.org/markup-compatibility/2006" xmlns:r="http://schemas.openxmlformats.org/officeDocument/2006/relationships" xmlns:w="http://schemas.openxmlformats.org/wordprocessingml/2006/main" xmlns:w14="http://schemas.microsoft.com/office/word/2010/wordml" xmlns:w15="http://schemas.microsoft.com/office/word/2012/wordml" mc:Ignorable="w14 w15">
   <w:docDefaults>
     <w:rPrDefault>
       <w:rPr>
-        <w:rFonts w:asciiTheme="minorHAnsi" w:eastAsiaTheme="minorHAnsi" w:hAnsiTheme="minorHAnsi" w:cstheme="minorBidi"/>
+        <w:rFonts w:asciiTheme="minorHAnsi" w:hAnsiTheme="minorHAnsi" w:eastAsiaTheme="minorHAnsi" w:cstheme="minorBidi"/>
         <w:kern w:val="2"/>
         <w:sz w:val="24"/>
         <w:szCs w:val="24"/>
@@ -358,7 +467,7 @@
       </w:pPr>
     </w:pPrDefault>
   </w:docDefaults>
-  <w:latentStyles w:defLockedState="0" w:defUIPriority="99" w:defSemiHidden="0" w:defUnhideWhenUsed="0" w:defQFormat="0" w:count="376">
+  <w:latentStyles xmlns:w="http://schemas.openxmlformats.org/wordprocessingml/2006/main" w:defLockedState="0" w:defUIPriority="99" w:defSemiHidden="0" w:defUnhideWhenUsed="0" w:defQFormat="0" w:count="376">
     <w:lsdException w:name="Normal" w:uiPriority="0" w:qFormat="1"/>
     <w:lsdException w:name="heading 1" w:uiPriority="9" w:qFormat="1"/>
     <w:lsdException w:name="heading 2" w:semiHidden="1" w:uiPriority="9" w:unhideWhenUsed="1" w:qFormat="1"/>
@@ -736,12 +845,31 @@
     <w:lsdException w:name="Unresolved Mention" w:semiHidden="1" w:unhideWhenUsed="1"/>
     <w:lsdException w:name="Smart Link" w:semiHidden="1" w:unhideWhenUsed="1"/>
   </w:latentStyles>
-  <w:style w:type="paragraph" w:default="1" w:styleId="Normal">
+  <w:style w:type="table" w:styleId="TableGrid">
+    <w:name w:val="Table Grid"/>
+    <w:basedOn w:val="TableNormal"/>
+    <w:tblPr>
+      <w:tblInd w:w="0" w:type="dxa"/>
+      <w:tblBorders>
+        <w:top w:val="single" w:sz="4" w:space="0" w:color="000000"/>
+        <w:left w:val="single" w:sz="4" w:space="0" w:color="000000"/>
+        <w:bottom w:val="single" w:sz="4" w:space="0" w:color="000000"/>
+        <w:right w:val="single" w:sz="4" w:space="0" w:color="000000"/>
+        <w:insideH w:val="single" w:sz="4" w:space="0" w:color="000000"/>
+        <w:insideV w:val="single" w:sz="4" w:space="0" w:color="000000"/>
+      </w:tblBorders>
+    </w:tblPr>
+  </w:style>
+  <w:style w:type="paragraph" w:styleId="Normal" w:default="1">
     <w:name w:val="Normal"/>
     <w:qFormat/>
+    <w:pPr>
+      <w:spacing/>
+    </w:pPr>
+    <w:rPr/>
   </w:style>
   <w:style w:type="paragraph" w:styleId="Heading1">
-    <w:name w:val="heading 1"/>
+    <w:name w:val="Heading 1"/>
     <w:basedOn w:val="Normal"/>
     <w:next w:val="Normal"/>
     <w:link w:val="Heading1Char"/>
@@ -754,14 +882,14 @@
       <w:outlineLvl w:val="0"/>
     </w:pPr>
     <w:rPr>
-      <w:rFonts w:asciiTheme="majorHAnsi" w:eastAsiaTheme="majorEastAsia" w:hAnsiTheme="majorHAnsi" w:cstheme="majorBidi"/>
+      <w:rFonts w:asciiTheme="majorHAnsi" w:hAnsiTheme="majorHAnsi" w:eastAsiaTheme="majorEastAsia" w:cstheme="majorBidi"/>
       <w:color w:val="0F4761"/>
       <w:sz w:val="40"/>
       <w:szCs w:val="40"/>
     </w:rPr>
   </w:style>
   <w:style w:type="paragraph" w:styleId="Heading2">
-    <w:name w:val="heading 2"/>
+    <w:name w:val="Heading 2"/>
     <w:basedOn w:val="Normal"/>
     <w:next w:val="Normal"/>
     <w:link w:val="Heading2Char"/>
@@ -776,14 +904,14 @@
       <w:outlineLvl w:val="1"/>
     </w:pPr>
     <w:rPr>
-      <w:rFonts w:asciiTheme="majorHAnsi" w:eastAsiaTheme="majorEastAsia" w:hAnsiTheme="majorHAnsi" w:cstheme="majorBidi"/>
+      <w:rFonts w:asciiTheme="majorHAnsi" w:hAnsiTheme="majorHAnsi" w:eastAsiaTheme="majorEastAsia" w:cstheme="majorBidi"/>
       <w:color w:val="0F4761"/>
       <w:sz w:val="32"/>
       <w:szCs w:val="32"/>
     </w:rPr>
   </w:style>
   <w:style w:type="paragraph" w:styleId="Heading3">
-    <w:name w:val="heading 3"/>
+    <w:name w:val="Heading 3"/>
     <w:basedOn w:val="Normal"/>
     <w:next w:val="Normal"/>
     <w:link w:val="Heading3Char"/>
@@ -805,7 +933,7 @@
     </w:rPr>
   </w:style>
   <w:style w:type="paragraph" w:styleId="Heading4">
-    <w:name w:val="heading 4"/>
+    <w:name w:val="Heading 4"/>
     <w:basedOn w:val="Normal"/>
     <w:next w:val="Normal"/>
     <w:link w:val="Heading4Char"/>
@@ -827,7 +955,7 @@
     </w:rPr>
   </w:style>
   <w:style w:type="paragraph" w:styleId="Heading5">
-    <w:name w:val="heading 5"/>
+    <w:name w:val="Heading 5"/>
     <w:basedOn w:val="Normal"/>
     <w:next w:val="Normal"/>
     <w:link w:val="Heading5Char"/>
@@ -847,7 +975,7 @@
     </w:rPr>
   </w:style>
   <w:style w:type="paragraph" w:styleId="Heading6">
-    <w:name w:val="heading 6"/>
+    <w:name w:val="Heading 6"/>
     <w:basedOn w:val="Normal"/>
     <w:next w:val="Normal"/>
     <w:link w:val="Heading6Char"/>
@@ -869,7 +997,7 @@
     </w:rPr>
   </w:style>
   <w:style w:type="paragraph" w:styleId="Heading7">
-    <w:name w:val="heading 7"/>
+    <w:name w:val="Heading 7"/>
     <w:basedOn w:val="Normal"/>
     <w:next w:val="Normal"/>
     <w:link w:val="Heading7Char"/>
@@ -889,7 +1017,7 @@
     </w:rPr>
   </w:style>
   <w:style w:type="paragraph" w:styleId="Heading8">
-    <w:name w:val="heading 8"/>
+    <w:name w:val="Heading 8"/>
     <w:basedOn w:val="Normal"/>
     <w:next w:val="Normal"/>
     <w:link w:val="Heading8Char"/>
@@ -911,7 +1039,7 @@
     </w:rPr>
   </w:style>
   <w:style w:type="paragraph" w:styleId="Heading9">
-    <w:name w:val="heading 9"/>
+    <w:name w:val="Heading 9"/>
     <w:basedOn w:val="Normal"/>
     <w:next w:val="Normal"/>
     <w:link w:val="Heading9Char"/>
@@ -930,13 +1058,13 @@
       <w:color w:val="272727"/>
     </w:rPr>
   </w:style>
-  <w:style w:type="character" w:default="1" w:styleId="DefaultParagraphFont">
+  <w:style w:type="character" w:styleId="DefaultParagraphFont" w:default="1">
     <w:name w:val="Default Paragraph Font"/>
     <w:uiPriority w:val="1"/>
-    <w:semiHidden/>
     <w:unhideWhenUsed/>
-  </w:style>
-  <w:style w:type="table" w:default="1" w:styleId="TableNormal">
+    <w:rPr/>
+  </w:style>
+  <w:style w:type="table" w:styleId="TableNormal" w:default="1">
     <w:name w:val="Normal Table"/>
     <w:uiPriority w:val="99"/>
     <w:semiHidden/>
@@ -951,52 +1079,38 @@
       </w:tblCellMar>
     </w:tblPr>
   </w:style>
-  <w:style w:type="numbering" w:default="1" w:styleId="NoList">
+  <w:style w:type="numbering" w:styleId="NoList">
     <w:name w:val="No List"/>
     <w:uiPriority w:val="99"/>
     <w:semiHidden/>
     <w:unhideWhenUsed/>
   </w:style>
-  <w:style w:type="table" w:styleId="TableGrid">
-    <w:name w:val="Table Grid"/>
-    <w:basedOn w:val="TableNormal"/>
-    <w:tblPr>
-      <w:tblBorders>
-        <w:top w:val="single" w:sz="4" w:space="0" w:color="000000"/>
-        <w:left w:val="single" w:sz="4" w:space="0" w:color="000000"/>
-        <w:bottom w:val="single" w:sz="4" w:space="0" w:color="000000"/>
-        <w:right w:val="single" w:sz="4" w:space="0" w:color="000000"/>
-        <w:insideH w:val="single" w:sz="4" w:space="0" w:color="000000"/>
-        <w:insideV w:val="single" w:sz="4" w:space="0" w:color="000000"/>
-      </w:tblBorders>
-    </w:tblPr>
-  </w:style>
-  <w:style w:type="character" w:customStyle="1" w:styleId="Heading1Char">
+  <w:style w:type="character" w:styleId="Heading1Char" w:customStyle="1">
     <w:name w:val="Heading 1 Char"/>
     <w:basedOn w:val="DefaultParagraphFont"/>
     <w:link w:val="Heading1"/>
     <w:uiPriority w:val="9"/>
     <w:rPr>
-      <w:rFonts w:asciiTheme="majorHAnsi" w:eastAsiaTheme="majorEastAsia" w:hAnsiTheme="majorHAnsi" w:cstheme="majorBidi"/>
+      <w:rFonts w:asciiTheme="majorHAnsi" w:hAnsiTheme="majorHAnsi" w:eastAsiaTheme="majorEastAsia" w:cstheme="majorBidi"/>
       <w:color w:val="0F4761"/>
       <w:sz w:val="40"/>
       <w:szCs w:val="40"/>
     </w:rPr>
   </w:style>
-  <w:style w:type="character" w:customStyle="1" w:styleId="Heading2Char">
+  <w:style w:type="character" w:styleId="Heading2Char" w:customStyle="1">
     <w:name w:val="Heading 2 Char"/>
     <w:basedOn w:val="DefaultParagraphFont"/>
     <w:link w:val="Heading2"/>
     <w:uiPriority w:val="9"/>
     <w:semiHidden/>
     <w:rPr>
-      <w:rFonts w:asciiTheme="majorHAnsi" w:eastAsiaTheme="majorEastAsia" w:hAnsiTheme="majorHAnsi" w:cstheme="majorBidi"/>
+      <w:rFonts w:asciiTheme="majorHAnsi" w:hAnsiTheme="majorHAnsi" w:eastAsiaTheme="majorEastAsia" w:cstheme="majorBidi"/>
       <w:color w:val="0F4761"/>
       <w:sz w:val="32"/>
       <w:szCs w:val="32"/>
     </w:rPr>
   </w:style>
-  <w:style w:type="character" w:customStyle="1" w:styleId="Heading3Char">
+  <w:style w:type="character" w:styleId="Heading3Char" w:customStyle="1">
     <w:name w:val="Heading 3 Char"/>
     <w:basedOn w:val="DefaultParagraphFont"/>
     <w:link w:val="Heading3"/>
@@ -1009,7 +1123,7 @@
       <w:szCs w:val="28"/>
     </w:rPr>
   </w:style>
-  <w:style w:type="character" w:customStyle="1" w:styleId="Heading4Char">
+  <w:style w:type="character" w:styleId="Heading4Char" w:customStyle="1">
     <w:name w:val="Heading 4 Char"/>
     <w:basedOn w:val="DefaultParagraphFont"/>
     <w:link w:val="Heading4"/>
@@ -1022,7 +1136,7 @@
       <w:color w:val="0F4761"/>
     </w:rPr>
   </w:style>
-  <w:style w:type="character" w:customStyle="1" w:styleId="Heading5Char">
+  <w:style w:type="character" w:styleId="Heading5Char" w:customStyle="1">
     <w:name w:val="Heading 5 Char"/>
     <w:basedOn w:val="DefaultParagraphFont"/>
     <w:link w:val="Heading5"/>
@@ -1033,7 +1147,7 @@
       <w:color w:val="0F4761"/>
     </w:rPr>
   </w:style>
-  <w:style w:type="character" w:customStyle="1" w:styleId="Heading6Char">
+  <w:style w:type="character" w:styleId="Heading6Char" w:customStyle="1">
     <w:name w:val="Heading 6 Char"/>
     <w:basedOn w:val="DefaultParagraphFont"/>
     <w:link w:val="Heading6"/>
@@ -1046,7 +1160,7 @@
       <w:color w:val="595959"/>
     </w:rPr>
   </w:style>
-  <w:style w:type="character" w:customStyle="1" w:styleId="Heading7Char">
+  <w:style w:type="character" w:styleId="Heading7Char" w:customStyle="1">
     <w:name w:val="Heading 7 Char"/>
     <w:basedOn w:val="DefaultParagraphFont"/>
     <w:link w:val="Heading7"/>
@@ -1057,7 +1171,7 @@
       <w:color w:val="595959"/>
     </w:rPr>
   </w:style>
-  <w:style w:type="character" w:customStyle="1" w:styleId="Heading8Char">
+  <w:style w:type="character" w:styleId="Heading8Char" w:customStyle="1">
     <w:name w:val="Heading 8 Char"/>
     <w:basedOn w:val="DefaultParagraphFont"/>
     <w:link w:val="Heading8"/>
@@ -1070,7 +1184,7 @@
       <w:color w:val="272727"/>
     </w:rPr>
   </w:style>
-  <w:style w:type="character" w:customStyle="1" w:styleId="Heading9Char">
+  <w:style w:type="character" w:styleId="Heading9Char" w:customStyle="1">
     <w:name w:val="Heading 9 Char"/>
     <w:basedOn w:val="DefaultParagraphFont"/>
     <w:link w:val="Heading9"/>
@@ -1093,20 +1207,20 @@
       <w:contextualSpacing/>
     </w:pPr>
     <w:rPr>
-      <w:rFonts w:asciiTheme="majorHAnsi" w:eastAsiaTheme="majorEastAsia" w:hAnsiTheme="majorHAnsi" w:cstheme="majorBidi"/>
+      <w:rFonts w:asciiTheme="majorHAnsi" w:hAnsiTheme="majorHAnsi" w:eastAsiaTheme="majorEastAsia" w:cstheme="majorBidi"/>
       <w:spacing w:val="-10"/>
       <w:kern w:val="28"/>
       <w:sz w:val="56"/>
       <w:szCs w:val="56"/>
     </w:rPr>
   </w:style>
-  <w:style w:type="character" w:customStyle="1" w:styleId="TitleChar">
+  <w:style w:type="character" w:styleId="TitleChar" w:customStyle="1">
     <w:name w:val="Title Char"/>
     <w:basedOn w:val="DefaultParagraphFont"/>
     <w:link w:val="Title"/>
     <w:uiPriority w:val="10"/>
     <w:rPr>
-      <w:rFonts w:asciiTheme="majorHAnsi" w:eastAsiaTheme="majorEastAsia" w:hAnsiTheme="majorHAnsi" w:cstheme="majorBidi"/>
+      <w:rFonts w:asciiTheme="majorHAnsi" w:hAnsiTheme="majorHAnsi" w:eastAsiaTheme="majorEastAsia" w:cstheme="majorBidi"/>
       <w:spacing w:val="-10"/>
       <w:kern w:val="28"/>
       <w:sz w:val="56"/>
@@ -1120,10 +1234,14 @@
     <w:link w:val="SubtitleChar"/>
     <w:uiPriority w:val="11"/>
     <w:qFormat/>
+    <w:numPr>
+      <w:ilvl w:val="1"/>
+    </w:numPr>
     <w:pPr>
       <w:numPr>
         <w:ilvl w:val="1"/>
       </w:numPr>
+      <w:spacing/>
     </w:pPr>
     <w:rPr>
       <w:rFonts w:eastAsiaTheme="majorEastAsia" w:cstheme="majorBidi"/>
@@ -1133,7 +1251,7 @@
       <w:szCs w:val="28"/>
     </w:rPr>
   </w:style>
-  <w:style w:type="character" w:customStyle="1" w:styleId="SubtitleChar">
+  <w:style w:type="character" w:styleId="SubtitleChar" w:customStyle="1">
     <w:name w:val="Subtitle Char"/>
     <w:basedOn w:val="DefaultParagraphFont"/>
     <w:link w:val="Subtitle"/>
@@ -1163,7 +1281,7 @@
       <w:color w:val="404040"/>
     </w:rPr>
   </w:style>
-  <w:style w:type="character" w:customStyle="1" w:styleId="QuoteChar">
+  <w:style w:type="character" w:styleId="QuoteChar" w:customStyle="1">
     <w:name w:val="Quote Char"/>
     <w:basedOn w:val="DefaultParagraphFont"/>
     <w:link w:val="Quote"/>
@@ -1180,12 +1298,14 @@
     <w:uiPriority w:val="34"/>
     <w:qFormat/>
     <w:pPr>
+      <w:spacing/>
       <w:ind w:left="720"/>
       <w:contextualSpacing/>
     </w:pPr>
-  </w:style>
-  <w:style w:type="character" w:customStyle="1" w:styleId="IntenseEmphasis1">
-    <w:name w:val="Intense Emphasis1"/>
+    <w:rPr/>
+  </w:style>
+  <w:style w:type="character" w:styleId="IntenseEmphasis" w:customStyle="1">
+    <w:name w:val="Intense Emphasis"/>
     <w:basedOn w:val="DefaultParagraphFont"/>
     <w:uiPriority w:val="21"/>
     <w:qFormat/>
@@ -1195,8 +1315,8 @@
       <w:color w:val="0F4761"/>
     </w:rPr>
   </w:style>
-  <w:style w:type="paragraph" w:customStyle="1" w:styleId="IntenseQuote1">
-    <w:name w:val="Intense Quote1"/>
+  <w:style w:type="paragraph" w:styleId="IntenseQuote" w:customStyle="1">
+    <w:name w:val="Intense Quote"/>
     <w:basedOn w:val="Normal"/>
     <w:next w:val="Normal"/>
     <w:link w:val="IntenseQuoteChar"/>
@@ -1204,8 +1324,8 @@
     <w:qFormat/>
     <w:pPr>
       <w:pBdr>
-        <w:top w:val="single" w:sz="4" w:space="10" w:color="0F4761"/>
-        <w:bottom w:val="single" w:sz="4" w:space="10" w:color="0F4761"/>
+        <w:top w:val="single" w:color="0F4761" w:sz="4" w:space="10"/>
+        <w:bottom w:val="single" w:color="0F4761" w:sz="4" w:space="10"/>
       </w:pBdr>
       <w:spacing w:before="360" w:after="360"/>
       <w:ind w:left="864" w:right="864"/>
@@ -1217,10 +1337,10 @@
       <w:color w:val="0F4761"/>
     </w:rPr>
   </w:style>
-  <w:style w:type="character" w:customStyle="1" w:styleId="IntenseQuoteChar">
+  <w:style w:type="character" w:styleId="IntenseQuoteChar" w:customStyle="1">
     <w:name w:val="Intense Quote Char"/>
     <w:basedOn w:val="DefaultParagraphFont"/>
-    <w:link w:val="IntenseQuote1"/>
+    <w:link w:val="IntenseQuote"/>
     <w:uiPriority w:val="30"/>
     <w:rPr>
       <w:i/>
@@ -1228,8 +1348,8 @@
       <w:color w:val="0F4761"/>
     </w:rPr>
   </w:style>
-  <w:style w:type="character" w:customStyle="1" w:styleId="IntenseReference1">
-    <w:name w:val="Intense Reference1"/>
+  <w:style w:type="character" w:styleId="IntenseReference" w:customStyle="1">
+    <w:name w:val="Intense Reference"/>
     <w:basedOn w:val="DefaultParagraphFont"/>
     <w:uiPriority w:val="32"/>
     <w:qFormat/>
@@ -1532,7 +1652,7 @@
       </a:bgFillStyleLst>
     </a:fmtScheme>
   </a:themeElements>
-  <a:objectDefaults>
+  <a:objectDefaults xmlns:a="http://schemas.openxmlformats.org/drawingml/2006/main">
     <a:lnDef>
       <a:spPr/>
       <a:bodyPr/>
@@ -1553,8 +1673,8 @@
       </a:style>
     </a:lnDef>
   </a:objectDefaults>
-  <a:extraClrSchemeLst/>
-  <a:extLst>
+  <a:extraClrSchemeLst xmlns:a="http://schemas.openxmlformats.org/drawingml/2006/main"/>
+  <a:extLst xmlns:a="http://schemas.openxmlformats.org/drawingml/2006/main">
     <a:ext uri="{05A4C25C-085E-4340-85A3-A5531E510DB2}">
       <thm15:themeFamily xmlns:thm15="http://schemas.microsoft.com/office/thememl/2012/main" name="Office Theme" id="{2E142A2C-CD16-42D6-873A-C26D2A0506FA}" vid="{1BDDFF52-6CD6-40A5-AB3C-68EB2F1E4D0A}"/>
     </a:ext>

</xml_diff>